<commit_message>
test(corpus): link case 06's style back to its list, and add a one-way link
From the review of #230: Word writes a level's linked style with a
w:numPr naming the list back, and case 06 linked one way only, so a plain
label could not tell "Word ignores the linked style" from "Word ignores a
one-way link". LabelParaStyle now names case 06's instance, and case 08
links a level to LabelParaOneWay, which names none.

The tests now check that every level is level 0 of a decimal list whose
label reads "1." (the override level too), that a linked style names
the paragraph's own list, the OpenType sample text itself, and that it is
in the document defaults' Calibri 11 pt. The comment on case 05 says that
the label's word box, not the line height, shows its size, since the
mark itself is 20 pt there.

Co-Authored-By: Claude Opus 5.5 <noreply@anthropic.com>
</commit_message>
<xml_diff>
--- a/tests/corpus/word-rules/E-list-label-format.docx
+++ b/tests/corpus/word-rules/E-list-label-format.docx
@@ -74,7 +74,7 @@
         </w:numPr>
       </w:pPr>
       <w:r>
-        <w:t xml:space="preserve">Case 06: level style LabelParaStyle (red, 20 pt)</w:t>
+        <w:t xml:space="preserve">Case 06: level style LabelParaStyle (red, 20 pt), linked both ways</w:t>
       </w:r>
     </w:p>
     <w:p>
@@ -90,6 +90,17 @@
       </w:pPr>
       <w:r>
         <w:t xml:space="preserve">Case 07: mark bold; level 20 pt</w:t>
+      </w:r>
+    </w:p>
+    <w:p>
+      <w:pPr>
+        <w:numPr>
+          <w:ilvl w:val="0"/>
+          <w:numId w:val="8"/>
+        </w:numPr>
+      </w:pPr>
+      <w:r>
+        <w:t xml:space="preserve">Case 08: level style LabelParaOneWay (red, 20 pt), linked one way</w:t>
       </w:r>
     </w:p>
     <w:sectPr>
@@ -216,6 +227,20 @@
         <w:sz w:val="40"/>
         <w:szCs w:val="40"/>
       </w:rPr>
+    </w:lvl>
+  </w:abstractNum>
+  <w:abstractNum w:abstractNumId="7">
+    <w:nsid w:val="5C3A0108"/>
+    <w:multiLevelType w:val="singleLevel"/>
+    <w:lvl w:ilvl="0">
+      <w:start w:val="1"/>
+      <w:numFmt w:val="decimal"/>
+      <w:pStyle w:val="LabelParaOneWay"/>
+      <w:lvlText w:val="%1."/>
+      <w:lvlJc w:val="left"/>
+      <w:pPr>
+        <w:ind w:left="720" w:hanging="360"/>
+      </w:pPr>
     </w:lvl>
   </w:abstractNum>
   <w:num w:numId="1">
@@ -254,6 +279,9 @@
   <w:num w:numId="7">
     <w:abstractNumId w:val="6"/>
   </w:num>
+  <w:num w:numId="8">
+    <w:abstractNumId w:val="7"/>
+  </w:num>
 </w:numbering>
 </file>
 
@@ -325,11 +353,25 @@
   <w:style w:type="paragraph" w:customStyle="1" w:styleId="LabelParaStyle">
     <w:name w:val="LabelParaStyle"/>
     <w:basedOn w:val="Normal"/>
+    <w:pPr>
+      <w:numPr>
+        <w:numId w:val="6"/>
+      </w:numPr>
+    </w:pPr>
     <w:rPr>
       <w:color w:val="FF0000"/>
       <w:sz w:val="40"/>
       <w:szCs w:val="40"/>
     </w:rPr>
   </w:style>
+  <w:style w:type="paragraph" w:customStyle="1" w:styleId="LabelParaOneWay">
+    <w:name w:val="LabelParaOneWay"/>
+    <w:basedOn w:val="Normal"/>
+    <w:rPr>
+      <w:color w:val="FF0000"/>
+      <w:sz w:val="40"/>
+      <w:szCs w:val="40"/>
+    </w:rPr>
+  </w:style>
 </w:styles>
 </file>
</xml_diff>